<commit_message>
Create GameDev.md, SiteDev.md Deleate README.md from src
</commit_message>
<xml_diff>
--- a/reports/Report.docx
+++ b/reports/Report.docx
@@ -332,20 +332,8 @@
           <w:u w:val="single"/>
           <w:lang w:eastAsia="en-US" w:bidi="en-US"/>
         </w:rPr>
-        <w:t xml:space="preserve">Хасянов Тимур </w:t>
-      </w:r>
-      <w:proofErr w:type="spellStart"/>
-      <w:r>
-        <w:rPr>
-          <w:rFonts w:ascii="Times New Roman" w:eastAsia="Times New Roman" w:hAnsi="Times New Roman" w:cs="Times New Roman"/>
-          <w:color w:val="000000"/>
-          <w:sz w:val="28"/>
-          <w:u w:val="single"/>
-          <w:lang w:eastAsia="en-US" w:bidi="en-US"/>
-        </w:rPr>
-        <w:t>Илдарович</w:t>
-      </w:r>
-      <w:proofErr w:type="spellEnd"/>
+        <w:t>Хасянов Тимур Илдарович</w:t>
+      </w:r>
       <w:r>
         <w:rPr>
           <w:rFonts w:ascii="Times New Roman" w:eastAsia="Times New Roman" w:hAnsi="Times New Roman" w:cs="Times New Roman"/>
@@ -1488,7 +1476,25 @@
           <w:sz w:val="28"/>
           <w:szCs w:val="28"/>
         </w:rPr>
-        <w:t xml:space="preserve">Целью проектной практики является закрепление теоретических знаний и применение навыков веб-разработки на практике посредством создания статического сайта «ЭКОПУЛЬС». В ходе выполнения проекта были использованы технологии </w:t>
+        <w:t>Целью проектной практики является закрепление теоретических знаний и применение навыков веб-разработки на практике посредством создания статического сайта «</w:t>
+      </w:r>
+      <w:r>
+        <w:rPr>
+          <w:rFonts w:ascii="Times New Roman" w:eastAsia="Times New Roman" w:hAnsi="Times New Roman" w:cs="Times New Roman"/>
+          <w:color w:val="000000"/>
+          <w:sz w:val="28"/>
+          <w:szCs w:val="28"/>
+        </w:rPr>
+        <w:t>Чат бот Салют</w:t>
+      </w:r>
+      <w:r>
+        <w:rPr>
+          <w:rFonts w:ascii="Times New Roman" w:eastAsia="Times New Roman" w:hAnsi="Times New Roman" w:cs="Times New Roman"/>
+          <w:color w:val="000000"/>
+          <w:sz w:val="28"/>
+          <w:szCs w:val="28"/>
+        </w:rPr>
+        <w:t xml:space="preserve">». В ходе выполнения проекта были использованы технологии </w:t>
       </w:r>
       <w:r>
         <w:rPr>
@@ -1672,7 +1678,25 @@
           <w:sz w:val="28"/>
           <w:szCs w:val="28"/>
         </w:rPr>
-        <w:t>Название проекта: «ЭКОПУЛЬС»</w:t>
+        <w:t>Название проекта: «</w:t>
+      </w:r>
+      <w:r>
+        <w:rPr>
+          <w:rFonts w:ascii="Times New Roman" w:eastAsia="Times New Roman" w:hAnsi="Times New Roman" w:cs="Times New Roman"/>
+          <w:color w:val="000000"/>
+          <w:sz w:val="28"/>
+          <w:szCs w:val="28"/>
+        </w:rPr>
+        <w:t>Чат бот Салют</w:t>
+      </w:r>
+      <w:r>
+        <w:rPr>
+          <w:rFonts w:ascii="Times New Roman" w:eastAsia="Times New Roman" w:hAnsi="Times New Roman" w:cs="Times New Roman"/>
+          <w:color w:val="000000"/>
+          <w:sz w:val="28"/>
+          <w:szCs w:val="28"/>
+        </w:rPr>
+        <w:t>»</w:t>
       </w:r>
       <w:r>
         <w:rPr>
@@ -1691,16 +1715,43 @@
           <w:szCs w:val="28"/>
         </w:rPr>
         <w:br/>
-        <w:t>Цель проекта: создание информационного веб-сайта, посвящённого экологическому мониторингу и устойчивому развитию микрорайонов. Проект направлен на привлечение внимания к вопросам экологии, озеленения городской среды и экологического просвещения.</w:t>
-      </w:r>
-      <w:r>
-        <w:rPr>
-          <w:rFonts w:ascii="Times New Roman" w:eastAsia="Times New Roman" w:hAnsi="Times New Roman" w:cs="Times New Roman"/>
-          <w:color w:val="000000"/>
-          <w:sz w:val="28"/>
-          <w:szCs w:val="28"/>
-        </w:rPr>
-        <w:br/>
+        <w:t xml:space="preserve">Цель проекта: </w:t>
+      </w:r>
+      <w:r>
+        <w:rPr>
+          <w:rFonts w:ascii="Times New Roman" w:eastAsia="Times New Roman" w:hAnsi="Times New Roman" w:cs="Times New Roman"/>
+          <w:color w:val="000000"/>
+          <w:sz w:val="28"/>
+          <w:szCs w:val="28"/>
+        </w:rPr>
+        <w:t xml:space="preserve">Создание чат бота с интеграцией ИИ для помощи работникам заводского предприятия </w:t>
+      </w:r>
+      <w:r>
+        <w:rPr>
+          <w:rFonts w:ascii="Times New Roman" w:eastAsia="Times New Roman" w:hAnsi="Times New Roman" w:cs="Times New Roman"/>
+          <w:color w:val="000000"/>
+          <w:sz w:val="28"/>
+          <w:szCs w:val="28"/>
+        </w:rPr>
+        <w:t>“</w:t>
+      </w:r>
+      <w:r>
+        <w:rPr>
+          <w:rFonts w:ascii="Times New Roman" w:eastAsia="Times New Roman" w:hAnsi="Times New Roman" w:cs="Times New Roman"/>
+          <w:color w:val="000000"/>
+          <w:sz w:val="28"/>
+          <w:szCs w:val="28"/>
+        </w:rPr>
+        <w:t>Салют</w:t>
+      </w:r>
+      <w:r>
+        <w:rPr>
+          <w:rFonts w:ascii="Times New Roman" w:eastAsia="Times New Roman" w:hAnsi="Times New Roman" w:cs="Times New Roman"/>
+          <w:color w:val="000000"/>
+          <w:sz w:val="28"/>
+          <w:szCs w:val="28"/>
+        </w:rPr>
+        <w:t>”</w:t>
       </w:r>
       <w:r>
         <w:rPr>
@@ -2046,7 +2097,6 @@
                 <w:color w:val="000000"/>
                 <w:sz w:val="20"/>
                 <w:szCs w:val="20"/>
-                <w:lang w:val="en-US"/>
               </w:rPr>
             </w:pPr>
             <w:r>
@@ -2055,9 +2105,394 @@
                 <w:color w:val="000000"/>
                 <w:sz w:val="20"/>
                 <w:szCs w:val="20"/>
-                <w:lang w:val="en-US"/>
               </w:rPr>
               <w:t>&lt;header class="site-header"&gt;</w:t>
+            </w:r>
+            <w:r>
+              <w:rPr>
+                <w:rFonts w:ascii="Consolas" w:eastAsia="Times New Roman" w:hAnsi="Consolas" w:cs="Times New Roman"/>
+                <w:color w:val="000000"/>
+                <w:sz w:val="20"/>
+                <w:szCs w:val="20"/>
+              </w:rPr>
+              <w:br/>
+              <w:t xml:space="preserve">    &lt;div class="container header-inner"&gt;</w:t>
+            </w:r>
+            <w:r>
+              <w:rPr>
+                <w:rFonts w:ascii="Consolas" w:eastAsia="Times New Roman" w:hAnsi="Consolas" w:cs="Times New Roman"/>
+                <w:color w:val="000000"/>
+                <w:sz w:val="20"/>
+                <w:szCs w:val="20"/>
+              </w:rPr>
+              <w:br/>
+              <w:t xml:space="preserve">        &lt;div class="logo"&gt;</w:t>
+            </w:r>
+            <w:r>
+              <w:rPr>
+                <w:rFonts w:ascii="Consolas" w:eastAsia="Times New Roman" w:hAnsi="Consolas" w:cs="Times New Roman"/>
+                <w:color w:val="000000"/>
+                <w:sz w:val="20"/>
+                <w:szCs w:val="20"/>
+              </w:rPr>
+              <w:br/>
+              <w:t xml:space="preserve">            &lt;div class="logo-icon"&gt;</w:t>
+            </w:r>
+            <w:r>
+              <w:rPr>
+                <w:rFonts w:ascii="Segoe UI Emoji" w:eastAsia="Times New Roman" w:hAnsi="Segoe UI Emoji" w:cs="Segoe UI Emoji"/>
+                <w:color w:val="000000"/>
+                <w:sz w:val="20"/>
+                <w:szCs w:val="20"/>
+              </w:rPr>
+              <w:t>✨</w:t>
+            </w:r>
+            <w:r>
+              <w:rPr>
+                <w:rFonts w:ascii="Consolas" w:eastAsia="Times New Roman" w:hAnsi="Consolas" w:cs="Times New Roman"/>
+                <w:color w:val="000000"/>
+                <w:sz w:val="20"/>
+                <w:szCs w:val="20"/>
+              </w:rPr>
+              <w:t>&lt;/div&gt;</w:t>
+            </w:r>
+            <w:r>
+              <w:rPr>
+                <w:rFonts w:ascii="Consolas" w:eastAsia="Times New Roman" w:hAnsi="Consolas" w:cs="Times New Roman"/>
+                <w:color w:val="000000"/>
+                <w:sz w:val="20"/>
+                <w:szCs w:val="20"/>
+              </w:rPr>
+              <w:br/>
+              <w:t xml:space="preserve">            &lt;div&gt;</w:t>
+            </w:r>
+            <w:r>
+              <w:rPr>
+                <w:rFonts w:ascii="Consolas" w:eastAsia="Times New Roman" w:hAnsi="Consolas" w:cs="Times New Roman"/>
+                <w:color w:val="000000"/>
+                <w:sz w:val="20"/>
+                <w:szCs w:val="20"/>
+              </w:rPr>
+              <w:br/>
+              <w:t xml:space="preserve">                &lt;h1&gt;</w:t>
+            </w:r>
+            <w:r>
+              <w:rPr>
+                <w:rFonts w:ascii="Consolas" w:eastAsia="Times New Roman" w:hAnsi="Consolas" w:cs="Consolas"/>
+                <w:color w:val="000000"/>
+                <w:sz w:val="20"/>
+                <w:szCs w:val="20"/>
+              </w:rPr>
+              <w:t>САЛЮТ</w:t>
+            </w:r>
+            <w:r>
+              <w:rPr>
+                <w:rFonts w:ascii="Consolas" w:eastAsia="Times New Roman" w:hAnsi="Consolas" w:cs="Times New Roman"/>
+                <w:color w:val="000000"/>
+                <w:sz w:val="20"/>
+                <w:szCs w:val="20"/>
+              </w:rPr>
+              <w:t>&lt;/h1&gt;</w:t>
+            </w:r>
+            <w:r>
+              <w:rPr>
+                <w:rFonts w:ascii="Consolas" w:eastAsia="Times New Roman" w:hAnsi="Consolas" w:cs="Times New Roman"/>
+                <w:color w:val="000000"/>
+                <w:sz w:val="20"/>
+                <w:szCs w:val="20"/>
+              </w:rPr>
+              <w:br/>
+              <w:t xml:space="preserve">                &lt;p&gt;</w:t>
+            </w:r>
+            <w:r>
+              <w:rPr>
+                <w:rFonts w:ascii="Consolas" w:eastAsia="Times New Roman" w:hAnsi="Consolas" w:cs="Consolas"/>
+                <w:color w:val="000000"/>
+                <w:sz w:val="20"/>
+                <w:szCs w:val="20"/>
+              </w:rPr>
+              <w:t>ИИ</w:t>
+            </w:r>
+            <w:r>
+              <w:rPr>
+                <w:rFonts w:ascii="Consolas" w:eastAsia="Times New Roman" w:hAnsi="Consolas" w:cs="Times New Roman"/>
+                <w:color w:val="000000"/>
+                <w:sz w:val="20"/>
+                <w:szCs w:val="20"/>
+              </w:rPr>
+              <w:t>-</w:t>
+            </w:r>
+            <w:r>
+              <w:rPr>
+                <w:rFonts w:ascii="Consolas" w:eastAsia="Times New Roman" w:hAnsi="Consolas" w:cs="Consolas"/>
+                <w:color w:val="000000"/>
+                <w:sz w:val="20"/>
+                <w:szCs w:val="20"/>
+              </w:rPr>
+              <w:t>ассистент</w:t>
+            </w:r>
+            <w:r>
+              <w:rPr>
+                <w:rFonts w:ascii="Consolas" w:eastAsia="Times New Roman" w:hAnsi="Consolas" w:cs="Times New Roman"/>
+                <w:color w:val="000000"/>
+                <w:sz w:val="20"/>
+                <w:szCs w:val="20"/>
+              </w:rPr>
+              <w:t xml:space="preserve"> </w:t>
+            </w:r>
+            <w:r>
+              <w:rPr>
+                <w:rFonts w:ascii="Consolas" w:eastAsia="Times New Roman" w:hAnsi="Consolas" w:cs="Consolas"/>
+                <w:color w:val="000000"/>
+                <w:sz w:val="20"/>
+                <w:szCs w:val="20"/>
+              </w:rPr>
+              <w:t>с</w:t>
+            </w:r>
+            <w:r>
+              <w:rPr>
+                <w:rFonts w:ascii="Consolas" w:eastAsia="Times New Roman" w:hAnsi="Consolas" w:cs="Times New Roman"/>
+                <w:color w:val="000000"/>
+                <w:sz w:val="20"/>
+                <w:szCs w:val="20"/>
+              </w:rPr>
+              <w:t xml:space="preserve"> </w:t>
+            </w:r>
+            <w:r>
+              <w:rPr>
+                <w:rFonts w:ascii="Consolas" w:eastAsia="Times New Roman" w:hAnsi="Consolas" w:cs="Consolas"/>
+                <w:color w:val="000000"/>
+                <w:sz w:val="20"/>
+                <w:szCs w:val="20"/>
+              </w:rPr>
+              <w:t>интеграцией</w:t>
+            </w:r>
+            <w:r>
+              <w:rPr>
+                <w:rFonts w:ascii="Consolas" w:eastAsia="Times New Roman" w:hAnsi="Consolas" w:cs="Times New Roman"/>
+                <w:color w:val="000000"/>
+                <w:sz w:val="20"/>
+                <w:szCs w:val="20"/>
+              </w:rPr>
+              <w:t xml:space="preserve"> </w:t>
+            </w:r>
+            <w:r>
+              <w:rPr>
+                <w:rFonts w:ascii="Consolas" w:eastAsia="Times New Roman" w:hAnsi="Consolas" w:cs="Consolas"/>
+                <w:color w:val="000000"/>
+                <w:sz w:val="20"/>
+                <w:szCs w:val="20"/>
+              </w:rPr>
+              <w:t>искусственного</w:t>
+            </w:r>
+            <w:r>
+              <w:rPr>
+                <w:rFonts w:ascii="Consolas" w:eastAsia="Times New Roman" w:hAnsi="Consolas" w:cs="Times New Roman"/>
+                <w:color w:val="000000"/>
+                <w:sz w:val="20"/>
+                <w:szCs w:val="20"/>
+              </w:rPr>
+              <w:t xml:space="preserve"> </w:t>
+            </w:r>
+            <w:r>
+              <w:rPr>
+                <w:rFonts w:ascii="Consolas" w:eastAsia="Times New Roman" w:hAnsi="Consolas" w:cs="Consolas"/>
+                <w:color w:val="000000"/>
+                <w:sz w:val="20"/>
+                <w:szCs w:val="20"/>
+              </w:rPr>
+              <w:t>интеллекта</w:t>
+            </w:r>
+            <w:r>
+              <w:rPr>
+                <w:rFonts w:ascii="Consolas" w:eastAsia="Times New Roman" w:hAnsi="Consolas" w:cs="Times New Roman"/>
+                <w:color w:val="000000"/>
+                <w:sz w:val="20"/>
+                <w:szCs w:val="20"/>
+              </w:rPr>
+              <w:t>&lt;/p&gt;</w:t>
+            </w:r>
+            <w:r>
+              <w:rPr>
+                <w:rFonts w:ascii="Consolas" w:eastAsia="Times New Roman" w:hAnsi="Consolas" w:cs="Times New Roman"/>
+                <w:color w:val="000000"/>
+                <w:sz w:val="20"/>
+                <w:szCs w:val="20"/>
+              </w:rPr>
+              <w:br/>
+              <w:t xml:space="preserve">            &lt;/div&gt;</w:t>
+            </w:r>
+            <w:r>
+              <w:rPr>
+                <w:rFonts w:ascii="Consolas" w:eastAsia="Times New Roman" w:hAnsi="Consolas" w:cs="Times New Roman"/>
+                <w:color w:val="000000"/>
+                <w:sz w:val="20"/>
+                <w:szCs w:val="20"/>
+              </w:rPr>
+              <w:br/>
+              <w:t xml:space="preserve">        &lt;/div&gt;</w:t>
+            </w:r>
+            <w:r>
+              <w:rPr>
+                <w:rFonts w:ascii="Consolas" w:eastAsia="Times New Roman" w:hAnsi="Consolas" w:cs="Times New Roman"/>
+                <w:color w:val="000000"/>
+                <w:sz w:val="20"/>
+                <w:szCs w:val="20"/>
+              </w:rPr>
+              <w:br/>
+              <w:t xml:space="preserve">        &lt;ul class="nav-links"&gt;</w:t>
+            </w:r>
+            <w:r>
+              <w:rPr>
+                <w:rFonts w:ascii="Consolas" w:eastAsia="Times New Roman" w:hAnsi="Consolas" w:cs="Times New Roman"/>
+                <w:color w:val="000000"/>
+                <w:sz w:val="20"/>
+                <w:szCs w:val="20"/>
+              </w:rPr>
+              <w:br/>
+              <w:t xml:space="preserve">            &lt;li&gt;&lt;a href="#home"&gt;</w:t>
+            </w:r>
+            <w:r>
+              <w:rPr>
+                <w:rFonts w:ascii="Consolas" w:eastAsia="Times New Roman" w:hAnsi="Consolas" w:cs="Consolas"/>
+                <w:color w:val="000000"/>
+                <w:sz w:val="20"/>
+                <w:szCs w:val="20"/>
+              </w:rPr>
+              <w:t>Главная</w:t>
+            </w:r>
+            <w:r>
+              <w:rPr>
+                <w:rFonts w:ascii="Consolas" w:eastAsia="Times New Roman" w:hAnsi="Consolas" w:cs="Times New Roman"/>
+                <w:color w:val="000000"/>
+                <w:sz w:val="20"/>
+                <w:szCs w:val="20"/>
+              </w:rPr>
+              <w:t>&lt;/a&gt;&lt;/li&gt;</w:t>
+            </w:r>
+            <w:r>
+              <w:rPr>
+                <w:rFonts w:ascii="Consolas" w:eastAsia="Times New Roman" w:hAnsi="Consolas" w:cs="Times New Roman"/>
+                <w:color w:val="000000"/>
+                <w:sz w:val="20"/>
+                <w:szCs w:val="20"/>
+              </w:rPr>
+              <w:br/>
+              <w:t xml:space="preserve">            &lt;li&gt;&lt;a href="#about"&gt;</w:t>
+            </w:r>
+            <w:r>
+              <w:rPr>
+                <w:rFonts w:ascii="Consolas" w:eastAsia="Times New Roman" w:hAnsi="Consolas" w:cs="Consolas"/>
+                <w:color w:val="000000"/>
+                <w:sz w:val="20"/>
+                <w:szCs w:val="20"/>
+              </w:rPr>
+              <w:t>О</w:t>
+            </w:r>
+            <w:r>
+              <w:rPr>
+                <w:rFonts w:ascii="Consolas" w:eastAsia="Times New Roman" w:hAnsi="Consolas" w:cs="Times New Roman"/>
+                <w:color w:val="000000"/>
+                <w:sz w:val="20"/>
+                <w:szCs w:val="20"/>
+              </w:rPr>
+              <w:t xml:space="preserve"> </w:t>
+            </w:r>
+            <w:r>
+              <w:rPr>
+                <w:rFonts w:ascii="Consolas" w:eastAsia="Times New Roman" w:hAnsi="Consolas" w:cs="Consolas"/>
+                <w:color w:val="000000"/>
+                <w:sz w:val="20"/>
+                <w:szCs w:val="20"/>
+              </w:rPr>
+              <w:t>проекте</w:t>
+            </w:r>
+            <w:r>
+              <w:rPr>
+                <w:rFonts w:ascii="Consolas" w:eastAsia="Times New Roman" w:hAnsi="Consolas" w:cs="Times New Roman"/>
+                <w:color w:val="000000"/>
+                <w:sz w:val="20"/>
+                <w:szCs w:val="20"/>
+              </w:rPr>
+              <w:t>&lt;/a&gt;&lt;/li&gt;</w:t>
+            </w:r>
+            <w:r>
+              <w:rPr>
+                <w:rFonts w:ascii="Consolas" w:eastAsia="Times New Roman" w:hAnsi="Consolas" w:cs="Times New Roman"/>
+                <w:color w:val="000000"/>
+                <w:sz w:val="20"/>
+                <w:szCs w:val="20"/>
+              </w:rPr>
+              <w:br/>
+              <w:t xml:space="preserve">            &lt;li&gt;&lt;a href="#members"&gt;</w:t>
+            </w:r>
+            <w:r>
+              <w:rPr>
+                <w:rFonts w:ascii="Consolas" w:eastAsia="Times New Roman" w:hAnsi="Consolas" w:cs="Consolas"/>
+                <w:color w:val="000000"/>
+                <w:sz w:val="20"/>
+                <w:szCs w:val="20"/>
+              </w:rPr>
+              <w:t>Участники</w:t>
+            </w:r>
+            <w:r>
+              <w:rPr>
+                <w:rFonts w:ascii="Consolas" w:eastAsia="Times New Roman" w:hAnsi="Consolas" w:cs="Times New Roman"/>
+                <w:color w:val="000000"/>
+                <w:sz w:val="20"/>
+                <w:szCs w:val="20"/>
+              </w:rPr>
+              <w:t>&lt;/a&gt;&lt;/li&gt;</w:t>
+            </w:r>
+            <w:r>
+              <w:rPr>
+                <w:rFonts w:ascii="Consolas" w:eastAsia="Times New Roman" w:hAnsi="Consolas" w:cs="Times New Roman"/>
+                <w:color w:val="000000"/>
+                <w:sz w:val="20"/>
+                <w:szCs w:val="20"/>
+              </w:rPr>
+              <w:br/>
+              <w:t xml:space="preserve">            &lt;li&gt;&lt;a href="#journal"&gt;Журнал&lt;/a&gt;&lt;/li&gt;</w:t>
+            </w:r>
+            <w:r>
+              <w:rPr>
+                <w:rFonts w:ascii="Consolas" w:eastAsia="Times New Roman" w:hAnsi="Consolas" w:cs="Times New Roman"/>
+                <w:color w:val="000000"/>
+                <w:sz w:val="20"/>
+                <w:szCs w:val="20"/>
+              </w:rPr>
+              <w:br/>
+              <w:t xml:space="preserve">            &lt;li&gt;&lt;a href="#resources"&gt;Ресурсы&lt;/a&gt;&lt;/li&gt;</w:t>
+            </w:r>
+            <w:r>
+              <w:rPr>
+                <w:rFonts w:ascii="Consolas" w:eastAsia="Times New Roman" w:hAnsi="Consolas" w:cs="Times New Roman"/>
+                <w:color w:val="000000"/>
+                <w:sz w:val="20"/>
+                <w:szCs w:val="20"/>
+              </w:rPr>
+              <w:br/>
+              <w:t xml:space="preserve">        &lt;/ul&gt;</w:t>
+            </w:r>
+            <w:r>
+              <w:rPr>
+                <w:rFonts w:ascii="Consolas" w:eastAsia="Times New Roman" w:hAnsi="Consolas" w:cs="Times New Roman"/>
+                <w:color w:val="000000"/>
+                <w:sz w:val="20"/>
+                <w:szCs w:val="20"/>
+              </w:rPr>
+              <w:br/>
+              <w:t xml:space="preserve">    &lt;/div&gt;</w:t>
+            </w:r>
+            <w:r>
+              <w:rPr>
+                <w:rFonts w:ascii="Consolas" w:eastAsia="Times New Roman" w:hAnsi="Consolas" w:cs="Times New Roman"/>
+                <w:color w:val="000000"/>
+                <w:sz w:val="20"/>
+                <w:szCs w:val="20"/>
+              </w:rPr>
+              <w:br/>
+              <w:t>&lt;/header&gt;</w:t>
             </w:r>
           </w:p>
           <w:p>
@@ -2065,510 +2500,12 @@
               <w:keepNext/>
               <w:keepLines/>
               <w:rPr>
-                <w:rFonts w:ascii="Consolas" w:eastAsia="Times New Roman" w:hAnsi="Consolas" w:cs="Times New Roman"/>
-                <w:color w:val="000000"/>
-                <w:sz w:val="20"/>
-                <w:szCs w:val="20"/>
-                <w:lang w:val="en-US"/>
-              </w:rPr>
-            </w:pPr>
-            <w:r>
-              <w:rPr>
-                <w:rFonts w:ascii="Consolas" w:eastAsia="Times New Roman" w:hAnsi="Consolas" w:cs="Times New Roman"/>
-                <w:color w:val="000000"/>
-                <w:sz w:val="20"/>
-                <w:szCs w:val="20"/>
-                <w:lang w:val="en-US"/>
-              </w:rPr>
-              <w:t xml:space="preserve">    &lt;div class="container header-inner"&gt;</w:t>
-            </w:r>
-          </w:p>
-          <w:p>
-            <w:pPr>
-              <w:keepNext/>
-              <w:keepLines/>
-              <w:rPr>
-                <w:rFonts w:ascii="Consolas" w:eastAsia="Times New Roman" w:hAnsi="Consolas" w:cs="Times New Roman"/>
-                <w:color w:val="000000"/>
-                <w:sz w:val="20"/>
-                <w:szCs w:val="20"/>
-                <w:lang w:val="en-US"/>
-              </w:rPr>
-            </w:pPr>
-            <w:r>
-              <w:rPr>
-                <w:rFonts w:ascii="Consolas" w:eastAsia="Times New Roman" w:hAnsi="Consolas" w:cs="Times New Roman"/>
-                <w:color w:val="000000"/>
-                <w:sz w:val="20"/>
-                <w:szCs w:val="20"/>
-                <w:lang w:val="en-US"/>
-              </w:rPr>
-              <w:t xml:space="preserve">        &lt;div class="logo"&gt;</w:t>
-            </w:r>
-          </w:p>
-          <w:p>
-            <w:pPr>
-              <w:keepNext/>
-              <w:keepLines/>
-              <w:rPr>
-                <w:rFonts w:ascii="Consolas" w:eastAsia="Times New Roman" w:hAnsi="Consolas" w:cs="Times New Roman"/>
-                <w:color w:val="000000"/>
-                <w:sz w:val="20"/>
-                <w:szCs w:val="20"/>
-                <w:lang w:val="en-US"/>
-              </w:rPr>
-            </w:pPr>
-            <w:r>
-              <w:rPr>
-                <w:rFonts w:ascii="Consolas" w:eastAsia="Times New Roman" w:hAnsi="Consolas" w:cs="Times New Roman"/>
-                <w:color w:val="000000"/>
-                <w:sz w:val="20"/>
-                <w:szCs w:val="20"/>
-                <w:lang w:val="en-US"/>
-              </w:rPr>
-              <w:t xml:space="preserve">            &lt;h1&gt;</w:t>
-            </w:r>
-            <w:r>
-              <w:rPr>
-                <w:rFonts w:ascii="Segoe UI Emoji" w:eastAsia="Times New Roman" w:hAnsi="Segoe UI Emoji" w:cs="Segoe UI Emoji"/>
-                <w:color w:val="000000"/>
-                <w:sz w:val="20"/>
-                <w:szCs w:val="20"/>
-              </w:rPr>
-              <w:t>🌱</w:t>
-            </w:r>
-            <w:r>
-              <w:rPr>
-                <w:rFonts w:ascii="Consolas" w:eastAsia="Times New Roman" w:hAnsi="Consolas" w:cs="Times New Roman"/>
-                <w:color w:val="000000"/>
-                <w:sz w:val="20"/>
-                <w:szCs w:val="20"/>
-                <w:lang w:val="en-US"/>
-              </w:rPr>
-              <w:t xml:space="preserve"> </w:t>
-            </w:r>
-            <w:r>
-              <w:rPr>
-                <w:rFonts w:ascii="Consolas" w:eastAsia="Times New Roman" w:hAnsi="Consolas" w:cs="Times New Roman"/>
-                <w:color w:val="000000"/>
-                <w:sz w:val="20"/>
-                <w:szCs w:val="20"/>
-              </w:rPr>
-              <w:t>ЭКОПУЛЬС</w:t>
-            </w:r>
-            <w:r>
-              <w:rPr>
-                <w:rFonts w:ascii="Consolas" w:eastAsia="Times New Roman" w:hAnsi="Consolas" w:cs="Times New Roman"/>
-                <w:color w:val="000000"/>
-                <w:sz w:val="20"/>
-                <w:szCs w:val="20"/>
-                <w:lang w:val="en-US"/>
-              </w:rPr>
-              <w:t>&lt;/h1&gt;</w:t>
-            </w:r>
-          </w:p>
-          <w:p>
-            <w:pPr>
-              <w:keepNext/>
-              <w:keepLines/>
-              <w:rPr>
-                <w:rFonts w:ascii="Consolas" w:eastAsia="Times New Roman" w:hAnsi="Consolas" w:cs="Times New Roman"/>
-                <w:color w:val="000000"/>
-                <w:sz w:val="20"/>
-                <w:szCs w:val="20"/>
-                <w:lang w:val="en-US"/>
-              </w:rPr>
-            </w:pPr>
-            <w:r>
-              <w:rPr>
-                <w:rFonts w:ascii="Consolas" w:eastAsia="Times New Roman" w:hAnsi="Consolas" w:cs="Times New Roman"/>
-                <w:color w:val="000000"/>
-                <w:sz w:val="20"/>
-                <w:szCs w:val="20"/>
-                <w:lang w:val="en-US"/>
-              </w:rPr>
-              <w:t xml:space="preserve">        &lt;/div&gt;</w:t>
-            </w:r>
-          </w:p>
-          <w:p>
-            <w:pPr>
-              <w:keepNext/>
-              <w:keepLines/>
-              <w:rPr>
-                <w:rFonts w:ascii="Consolas" w:eastAsia="Times New Roman" w:hAnsi="Consolas" w:cs="Times New Roman"/>
-                <w:color w:val="000000"/>
-                <w:sz w:val="20"/>
-                <w:szCs w:val="20"/>
-                <w:lang w:val="en-US"/>
-              </w:rPr>
-            </w:pPr>
-          </w:p>
-          <w:p>
-            <w:pPr>
-              <w:keepNext/>
-              <w:keepLines/>
-              <w:rPr>
-                <w:rFonts w:ascii="Consolas" w:eastAsia="Times New Roman" w:hAnsi="Consolas" w:cs="Times New Roman"/>
-                <w:color w:val="000000"/>
-                <w:sz w:val="20"/>
-                <w:szCs w:val="20"/>
-                <w:lang w:val="en-US"/>
-              </w:rPr>
-            </w:pPr>
-            <w:r>
-              <w:rPr>
-                <w:rFonts w:ascii="Consolas" w:eastAsia="Times New Roman" w:hAnsi="Consolas" w:cs="Times New Roman"/>
-                <w:color w:val="000000"/>
-                <w:sz w:val="20"/>
-                <w:szCs w:val="20"/>
-                <w:lang w:val="en-US"/>
-              </w:rPr>
-              <w:t xml:space="preserve">        &lt;ul class="nav-links"&gt;</w:t>
-            </w:r>
-          </w:p>
-          <w:p>
-            <w:pPr>
-              <w:keepNext/>
-              <w:keepLines/>
-              <w:rPr>
-                <w:rFonts w:ascii="Consolas" w:eastAsia="Times New Roman" w:hAnsi="Consolas" w:cs="Times New Roman"/>
-                <w:color w:val="000000"/>
-                <w:sz w:val="20"/>
-                <w:szCs w:val="20"/>
-                <w:lang w:val="en-US"/>
-              </w:rPr>
-            </w:pPr>
-            <w:r>
-              <w:rPr>
-                <w:rFonts w:ascii="Consolas" w:eastAsia="Times New Roman" w:hAnsi="Consolas" w:cs="Times New Roman"/>
-                <w:color w:val="000000"/>
-                <w:sz w:val="20"/>
-                <w:szCs w:val="20"/>
-                <w:lang w:val="en-US"/>
-              </w:rPr>
-              <w:t xml:space="preserve">            &lt;li&gt;&lt;a </w:t>
-            </w:r>
-            <w:proofErr w:type="spellStart"/>
-            <w:r>
-              <w:rPr>
-                <w:rFonts w:ascii="Consolas" w:eastAsia="Times New Roman" w:hAnsi="Consolas" w:cs="Times New Roman"/>
-                <w:color w:val="000000"/>
-                <w:sz w:val="20"/>
-                <w:szCs w:val="20"/>
-                <w:lang w:val="en-US"/>
-              </w:rPr>
-              <w:t>href</w:t>
-            </w:r>
-            <w:proofErr w:type="spellEnd"/>
-            <w:r>
-              <w:rPr>
-                <w:rFonts w:ascii="Consolas" w:eastAsia="Times New Roman" w:hAnsi="Consolas" w:cs="Times New Roman"/>
-                <w:color w:val="000000"/>
-                <w:sz w:val="20"/>
-                <w:szCs w:val="20"/>
-                <w:lang w:val="en-US"/>
-              </w:rPr>
-              <w:t>="#home"&gt;</w:t>
-            </w:r>
-            <w:r>
-              <w:rPr>
-                <w:rFonts w:ascii="Consolas" w:eastAsia="Times New Roman" w:hAnsi="Consolas" w:cs="Times New Roman"/>
-                <w:color w:val="000000"/>
-                <w:sz w:val="20"/>
-                <w:szCs w:val="20"/>
-              </w:rPr>
-              <w:t>Главная</w:t>
-            </w:r>
-            <w:r>
-              <w:rPr>
-                <w:rFonts w:ascii="Consolas" w:eastAsia="Times New Roman" w:hAnsi="Consolas" w:cs="Times New Roman"/>
-                <w:color w:val="000000"/>
-                <w:sz w:val="20"/>
-                <w:szCs w:val="20"/>
-                <w:lang w:val="en-US"/>
-              </w:rPr>
-              <w:t>&lt;/a&gt;&lt;/li&gt;</w:t>
-            </w:r>
-          </w:p>
-          <w:p>
-            <w:pPr>
-              <w:keepNext/>
-              <w:keepLines/>
-              <w:rPr>
-                <w:rFonts w:ascii="Consolas" w:eastAsia="Times New Roman" w:hAnsi="Consolas" w:cs="Times New Roman"/>
-                <w:color w:val="000000"/>
-                <w:sz w:val="20"/>
-                <w:szCs w:val="20"/>
-                <w:lang w:val="en-US"/>
-              </w:rPr>
-            </w:pPr>
-            <w:r>
-              <w:rPr>
-                <w:rFonts w:ascii="Consolas" w:eastAsia="Times New Roman" w:hAnsi="Consolas" w:cs="Times New Roman"/>
-                <w:color w:val="000000"/>
-                <w:sz w:val="20"/>
-                <w:szCs w:val="20"/>
-                <w:lang w:val="en-US"/>
-              </w:rPr>
-              <w:t xml:space="preserve">            &lt;li&gt;&lt;a </w:t>
-            </w:r>
-            <w:proofErr w:type="spellStart"/>
-            <w:r>
-              <w:rPr>
-                <w:rFonts w:ascii="Consolas" w:eastAsia="Times New Roman" w:hAnsi="Consolas" w:cs="Times New Roman"/>
-                <w:color w:val="000000"/>
-                <w:sz w:val="20"/>
-                <w:szCs w:val="20"/>
-                <w:lang w:val="en-US"/>
-              </w:rPr>
-              <w:t>href</w:t>
-            </w:r>
-            <w:proofErr w:type="spellEnd"/>
-            <w:r>
-              <w:rPr>
-                <w:rFonts w:ascii="Consolas" w:eastAsia="Times New Roman" w:hAnsi="Consolas" w:cs="Times New Roman"/>
-                <w:color w:val="000000"/>
-                <w:sz w:val="20"/>
-                <w:szCs w:val="20"/>
-                <w:lang w:val="en-US"/>
-              </w:rPr>
-              <w:t>="#about"&gt;</w:t>
-            </w:r>
-            <w:r>
-              <w:rPr>
-                <w:rFonts w:ascii="Consolas" w:eastAsia="Times New Roman" w:hAnsi="Consolas" w:cs="Times New Roman"/>
-                <w:color w:val="000000"/>
-                <w:sz w:val="20"/>
-                <w:szCs w:val="20"/>
-              </w:rPr>
-              <w:t>О</w:t>
-            </w:r>
-            <w:r>
-              <w:rPr>
-                <w:rFonts w:ascii="Consolas" w:eastAsia="Times New Roman" w:hAnsi="Consolas" w:cs="Times New Roman"/>
-                <w:color w:val="000000"/>
-                <w:sz w:val="20"/>
-                <w:szCs w:val="20"/>
-                <w:lang w:val="en-US"/>
-              </w:rPr>
-              <w:t xml:space="preserve"> </w:t>
-            </w:r>
-            <w:r>
-              <w:rPr>
-                <w:rFonts w:ascii="Consolas" w:eastAsia="Times New Roman" w:hAnsi="Consolas" w:cs="Times New Roman"/>
-                <w:color w:val="000000"/>
-                <w:sz w:val="20"/>
-                <w:szCs w:val="20"/>
-              </w:rPr>
-              <w:t>проекте</w:t>
-            </w:r>
-            <w:r>
-              <w:rPr>
-                <w:rFonts w:ascii="Consolas" w:eastAsia="Times New Roman" w:hAnsi="Consolas" w:cs="Times New Roman"/>
-                <w:color w:val="000000"/>
-                <w:sz w:val="20"/>
-                <w:szCs w:val="20"/>
-                <w:lang w:val="en-US"/>
-              </w:rPr>
-              <w:t>&lt;/a&gt;&lt;/li&gt;</w:t>
-            </w:r>
-          </w:p>
-          <w:p>
-            <w:pPr>
-              <w:keepNext/>
-              <w:keepLines/>
-              <w:rPr>
-                <w:rFonts w:ascii="Consolas" w:eastAsia="Times New Roman" w:hAnsi="Consolas" w:cs="Times New Roman"/>
-                <w:color w:val="000000"/>
-                <w:sz w:val="20"/>
-                <w:szCs w:val="20"/>
-                <w:lang w:val="en-US"/>
-              </w:rPr>
-            </w:pPr>
-            <w:r>
-              <w:rPr>
-                <w:rFonts w:ascii="Consolas" w:eastAsia="Times New Roman" w:hAnsi="Consolas" w:cs="Times New Roman"/>
-                <w:color w:val="000000"/>
-                <w:sz w:val="20"/>
-                <w:szCs w:val="20"/>
-                <w:lang w:val="en-US"/>
-              </w:rPr>
-              <w:t xml:space="preserve">            &lt;li&gt;&lt;a </w:t>
-            </w:r>
-            <w:proofErr w:type="spellStart"/>
-            <w:r>
-              <w:rPr>
-                <w:rFonts w:ascii="Consolas" w:eastAsia="Times New Roman" w:hAnsi="Consolas" w:cs="Times New Roman"/>
-                <w:color w:val="000000"/>
-                <w:sz w:val="20"/>
-                <w:szCs w:val="20"/>
-                <w:lang w:val="en-US"/>
-              </w:rPr>
-              <w:t>href</w:t>
-            </w:r>
-            <w:proofErr w:type="spellEnd"/>
-            <w:r>
-              <w:rPr>
-                <w:rFonts w:ascii="Consolas" w:eastAsia="Times New Roman" w:hAnsi="Consolas" w:cs="Times New Roman"/>
-                <w:color w:val="000000"/>
-                <w:sz w:val="20"/>
-                <w:szCs w:val="20"/>
-                <w:lang w:val="en-US"/>
-              </w:rPr>
-              <w:t>="#members"&gt;</w:t>
-            </w:r>
-            <w:r>
-              <w:rPr>
-                <w:rFonts w:ascii="Consolas" w:eastAsia="Times New Roman" w:hAnsi="Consolas" w:cs="Times New Roman"/>
-                <w:color w:val="000000"/>
-                <w:sz w:val="20"/>
-                <w:szCs w:val="20"/>
-              </w:rPr>
-              <w:t>Участники</w:t>
-            </w:r>
-            <w:r>
-              <w:rPr>
-                <w:rFonts w:ascii="Consolas" w:eastAsia="Times New Roman" w:hAnsi="Consolas" w:cs="Times New Roman"/>
-                <w:color w:val="000000"/>
-                <w:sz w:val="20"/>
-                <w:szCs w:val="20"/>
-                <w:lang w:val="en-US"/>
-              </w:rPr>
-              <w:t>&lt;/a&gt;&lt;/li&gt;</w:t>
-            </w:r>
-          </w:p>
-          <w:p>
-            <w:pPr>
-              <w:keepNext/>
-              <w:keepLines/>
-              <w:rPr>
-                <w:rFonts w:ascii="Consolas" w:eastAsia="Times New Roman" w:hAnsi="Consolas" w:cs="Times New Roman"/>
-                <w:color w:val="000000"/>
-                <w:sz w:val="20"/>
-                <w:szCs w:val="20"/>
-              </w:rPr>
-            </w:pPr>
-            <w:r>
-              <w:rPr>
-                <w:rFonts w:ascii="Consolas" w:eastAsia="Times New Roman" w:hAnsi="Consolas" w:cs="Times New Roman"/>
-                <w:color w:val="000000"/>
-                <w:sz w:val="20"/>
-                <w:szCs w:val="20"/>
-                <w:lang w:val="en-US"/>
-              </w:rPr>
-              <w:t xml:space="preserve">        </w:t>
-            </w:r>
-            <w:r>
-              <w:rPr>
-                <w:rFonts w:ascii="Consolas" w:eastAsia="Times New Roman" w:hAnsi="Consolas" w:cs="Times New Roman"/>
-                <w:color w:val="000000"/>
-                <w:sz w:val="20"/>
-                <w:szCs w:val="20"/>
-              </w:rPr>
-              <w:t>&lt;/</w:t>
-            </w:r>
-            <w:proofErr w:type="spellStart"/>
-            <w:r>
-              <w:rPr>
-                <w:rFonts w:ascii="Consolas" w:eastAsia="Times New Roman" w:hAnsi="Consolas" w:cs="Times New Roman"/>
-                <w:color w:val="000000"/>
-                <w:sz w:val="20"/>
-                <w:szCs w:val="20"/>
-              </w:rPr>
-              <w:t>ul</w:t>
-            </w:r>
-            <w:proofErr w:type="spellEnd"/>
-            <w:r>
-              <w:rPr>
-                <w:rFonts w:ascii="Consolas" w:eastAsia="Times New Roman" w:hAnsi="Consolas" w:cs="Times New Roman"/>
-                <w:color w:val="000000"/>
-                <w:sz w:val="20"/>
-                <w:szCs w:val="20"/>
-              </w:rPr>
-              <w:t>&gt;</w:t>
-            </w:r>
-          </w:p>
-          <w:p>
-            <w:pPr>
-              <w:keepNext/>
-              <w:keepLines/>
-              <w:rPr>
-                <w:rFonts w:ascii="Consolas" w:eastAsia="Times New Roman" w:hAnsi="Consolas" w:cs="Times New Roman"/>
-                <w:color w:val="000000"/>
-                <w:sz w:val="20"/>
-                <w:szCs w:val="20"/>
-              </w:rPr>
-            </w:pPr>
-            <w:r>
-              <w:rPr>
-                <w:rFonts w:ascii="Consolas" w:eastAsia="Times New Roman" w:hAnsi="Consolas" w:cs="Times New Roman"/>
-                <w:color w:val="000000"/>
-                <w:sz w:val="20"/>
-                <w:szCs w:val="20"/>
-              </w:rPr>
-              <w:t xml:space="preserve">    &lt;/</w:t>
-            </w:r>
-            <w:proofErr w:type="spellStart"/>
-            <w:r>
-              <w:rPr>
-                <w:rFonts w:ascii="Consolas" w:eastAsia="Times New Roman" w:hAnsi="Consolas" w:cs="Times New Roman"/>
-                <w:color w:val="000000"/>
-                <w:sz w:val="20"/>
-                <w:szCs w:val="20"/>
-              </w:rPr>
-              <w:t>div</w:t>
-            </w:r>
-            <w:proofErr w:type="spellEnd"/>
-            <w:r>
-              <w:rPr>
-                <w:rFonts w:ascii="Consolas" w:eastAsia="Times New Roman" w:hAnsi="Consolas" w:cs="Times New Roman"/>
-                <w:color w:val="000000"/>
-                <w:sz w:val="20"/>
-                <w:szCs w:val="20"/>
-              </w:rPr>
-              <w:t>&gt;</w:t>
-            </w:r>
-          </w:p>
-          <w:p>
-            <w:pPr>
-              <w:keepNext/>
-              <w:keepLines/>
-              <w:rPr>
                 <w:rFonts w:ascii="Times New Roman" w:eastAsia="Times New Roman" w:hAnsi="Times New Roman" w:cs="Times New Roman"/>
                 <w:color w:val="000000"/>
                 <w:sz w:val="28"/>
                 <w:szCs w:val="28"/>
               </w:rPr>
             </w:pPr>
-            <w:r>
-              <w:rPr>
-                <w:rFonts w:ascii="Consolas" w:eastAsia="Times New Roman" w:hAnsi="Consolas" w:cs="Times New Roman"/>
-                <w:color w:val="000000"/>
-                <w:sz w:val="20"/>
-                <w:szCs w:val="20"/>
-              </w:rPr>
-              <w:t>&lt;/</w:t>
-            </w:r>
-            <w:proofErr w:type="spellStart"/>
-            <w:r>
-              <w:rPr>
-                <w:rFonts w:ascii="Consolas" w:eastAsia="Times New Roman" w:hAnsi="Consolas" w:cs="Times New Roman"/>
-                <w:color w:val="000000"/>
-                <w:sz w:val="20"/>
-                <w:szCs w:val="20"/>
-              </w:rPr>
-              <w:t>header</w:t>
-            </w:r>
-            <w:proofErr w:type="spellEnd"/>
-            <w:r>
-              <w:rPr>
-                <w:rFonts w:ascii="Consolas" w:eastAsia="Times New Roman" w:hAnsi="Consolas" w:cs="Times New Roman"/>
-                <w:color w:val="000000"/>
-                <w:sz w:val="20"/>
-                <w:szCs w:val="20"/>
-              </w:rPr>
-              <w:t>&gt;</w:t>
-            </w:r>
           </w:p>
         </w:tc>
       </w:tr>
@@ -3185,7 +3122,6 @@
         </w:rPr>
         <w:t xml:space="preserve"> с использованием библиотеки </w:t>
       </w:r>
-      <w:proofErr w:type="spellStart"/>
       <w:r>
         <w:rPr>
           <w:rFonts w:ascii="Times New Roman" w:eastAsia="Times New Roman" w:hAnsi="Times New Roman" w:cs="Times New Roman"/>
@@ -3196,7 +3132,6 @@
         </w:rPr>
         <w:t>Pygame</w:t>
       </w:r>
-      <w:proofErr w:type="spellEnd"/>
       <w:r>
         <w:rPr>
           <w:rFonts w:ascii="Times New Roman" w:eastAsia="Times New Roman" w:hAnsi="Times New Roman" w:cs="Times New Roman"/>
@@ -3492,7 +3427,6 @@
         </w:rPr>
         <w:t xml:space="preserve"> и библиотеки </w:t>
       </w:r>
-      <w:proofErr w:type="spellStart"/>
       <w:r>
         <w:rPr>
           <w:rFonts w:ascii="Times New Roman" w:eastAsia="Times New Roman" w:hAnsi="Times New Roman" w:cs="Times New Roman"/>
@@ -3503,7 +3437,6 @@
         </w:rPr>
         <w:t>Pygame</w:t>
       </w:r>
-      <w:proofErr w:type="spellEnd"/>
       <w:r>
         <w:rPr>
           <w:rFonts w:ascii="Times New Roman" w:eastAsia="Times New Roman" w:hAnsi="Times New Roman" w:cs="Times New Roman"/>
@@ -3626,7 +3559,6 @@
           <w:color w:val="000000"/>
           <w:sz w:val="28"/>
           <w:szCs w:val="28"/>
-          <w:lang w:val="en-US"/>
         </w:rPr>
         <w:br/>
       </w:r>
@@ -3666,51 +3598,7 @@
                 <w:szCs w:val="20"/>
                 <w:lang w:val="en-US"/>
               </w:rPr>
-              <w:t xml:space="preserve">if </w:t>
-            </w:r>
-            <w:proofErr w:type="spellStart"/>
-            <w:r>
-              <w:rPr>
-                <w:rFonts w:ascii="Consolas" w:eastAsia="Times New Roman" w:hAnsi="Consolas" w:cs="Times New Roman"/>
-                <w:color w:val="000000"/>
-                <w:sz w:val="20"/>
-                <w:szCs w:val="20"/>
-                <w:lang w:val="en-US"/>
-              </w:rPr>
-              <w:t>self.player.get_rect</w:t>
-            </w:r>
-            <w:proofErr w:type="spellEnd"/>
-            <w:r>
-              <w:rPr>
-                <w:rFonts w:ascii="Consolas" w:eastAsia="Times New Roman" w:hAnsi="Consolas" w:cs="Times New Roman"/>
-                <w:color w:val="000000"/>
-                <w:sz w:val="20"/>
-                <w:szCs w:val="20"/>
-                <w:lang w:val="en-US"/>
-              </w:rPr>
-              <w:t>().</w:t>
-            </w:r>
-            <w:proofErr w:type="spellStart"/>
-            <w:r>
-              <w:rPr>
-                <w:rFonts w:ascii="Consolas" w:eastAsia="Times New Roman" w:hAnsi="Consolas" w:cs="Times New Roman"/>
-                <w:color w:val="000000"/>
-                <w:sz w:val="20"/>
-                <w:szCs w:val="20"/>
-                <w:lang w:val="en-US"/>
-              </w:rPr>
-              <w:t>colliderect</w:t>
-            </w:r>
-            <w:proofErr w:type="spellEnd"/>
-            <w:r>
-              <w:rPr>
-                <w:rFonts w:ascii="Consolas" w:eastAsia="Times New Roman" w:hAnsi="Consolas" w:cs="Times New Roman"/>
-                <w:color w:val="000000"/>
-                <w:sz w:val="20"/>
-                <w:szCs w:val="20"/>
-                <w:lang w:val="en-US"/>
-              </w:rPr>
-              <w:t>(</w:t>
+              <w:t>if self.player.get_rect().colliderect(</w:t>
             </w:r>
           </w:p>
           <w:p>
@@ -3733,29 +3621,7 @@
                 <w:szCs w:val="20"/>
                 <w:lang w:val="en-US"/>
               </w:rPr>
-              <w:t xml:space="preserve">        </w:t>
-            </w:r>
-            <w:proofErr w:type="spellStart"/>
-            <w:r>
-              <w:rPr>
-                <w:rFonts w:ascii="Consolas" w:eastAsia="Times New Roman" w:hAnsi="Consolas" w:cs="Times New Roman"/>
-                <w:color w:val="000000"/>
-                <w:sz w:val="20"/>
-                <w:szCs w:val="20"/>
-                <w:lang w:val="en-US"/>
-              </w:rPr>
-              <w:t>self.star.get_rect</w:t>
-            </w:r>
-            <w:proofErr w:type="spellEnd"/>
-            <w:r>
-              <w:rPr>
-                <w:rFonts w:ascii="Consolas" w:eastAsia="Times New Roman" w:hAnsi="Consolas" w:cs="Times New Roman"/>
-                <w:color w:val="000000"/>
-                <w:sz w:val="20"/>
-                <w:szCs w:val="20"/>
-                <w:lang w:val="en-US"/>
-              </w:rPr>
-              <w:t>()):</w:t>
+              <w:t xml:space="preserve">        self.star.get_rect()):</w:t>
             </w:r>
           </w:p>
           <w:p>
@@ -3791,29 +3657,7 @@
                 <w:szCs w:val="20"/>
                 <w:lang w:val="en-US"/>
               </w:rPr>
-              <w:t xml:space="preserve">    </w:t>
-            </w:r>
-            <w:proofErr w:type="spellStart"/>
-            <w:r>
-              <w:rPr>
-                <w:rFonts w:ascii="Consolas" w:eastAsia="Times New Roman" w:hAnsi="Consolas" w:cs="Times New Roman"/>
-                <w:color w:val="000000"/>
-                <w:sz w:val="20"/>
-                <w:szCs w:val="20"/>
-                <w:lang w:val="en-US"/>
-              </w:rPr>
-              <w:t>self.score</w:t>
-            </w:r>
-            <w:proofErr w:type="spellEnd"/>
-            <w:r>
-              <w:rPr>
-                <w:rFonts w:ascii="Consolas" w:eastAsia="Times New Roman" w:hAnsi="Consolas" w:cs="Times New Roman"/>
-                <w:color w:val="000000"/>
-                <w:sz w:val="20"/>
-                <w:szCs w:val="20"/>
-                <w:lang w:val="en-US"/>
-              </w:rPr>
-              <w:t xml:space="preserve"> += 10</w:t>
+              <w:t xml:space="preserve">    self.score += 10</w:t>
             </w:r>
           </w:p>
           <w:p>
@@ -3836,29 +3680,7 @@
                 <w:szCs w:val="20"/>
                 <w:lang w:val="en-US"/>
               </w:rPr>
-              <w:t xml:space="preserve">    </w:t>
-            </w:r>
-            <w:proofErr w:type="spellStart"/>
-            <w:r>
-              <w:rPr>
-                <w:rFonts w:ascii="Consolas" w:eastAsia="Times New Roman" w:hAnsi="Consolas" w:cs="Times New Roman"/>
-                <w:color w:val="000000"/>
-                <w:sz w:val="20"/>
-                <w:szCs w:val="20"/>
-                <w:lang w:val="en-US"/>
-              </w:rPr>
-              <w:t>self.stars_caught</w:t>
-            </w:r>
-            <w:proofErr w:type="spellEnd"/>
-            <w:r>
-              <w:rPr>
-                <w:rFonts w:ascii="Consolas" w:eastAsia="Times New Roman" w:hAnsi="Consolas" w:cs="Times New Roman"/>
-                <w:color w:val="000000"/>
-                <w:sz w:val="20"/>
-                <w:szCs w:val="20"/>
-                <w:lang w:val="en-US"/>
-              </w:rPr>
-              <w:t xml:space="preserve"> += 1</w:t>
+              <w:t xml:space="preserve">    self.stars_caught += 1</w:t>
             </w:r>
           </w:p>
           <w:p>
@@ -3894,29 +3716,7 @@
                 <w:szCs w:val="20"/>
                 <w:lang w:val="en-US"/>
               </w:rPr>
-              <w:t xml:space="preserve">    </w:t>
-            </w:r>
-            <w:proofErr w:type="spellStart"/>
-            <w:r>
-              <w:rPr>
-                <w:rFonts w:ascii="Consolas" w:eastAsia="Times New Roman" w:hAnsi="Consolas" w:cs="Times New Roman"/>
-                <w:color w:val="000000"/>
-                <w:sz w:val="20"/>
-                <w:szCs w:val="20"/>
-                <w:lang w:val="en-US"/>
-              </w:rPr>
-              <w:t>self.star.reset</w:t>
-            </w:r>
-            <w:proofErr w:type="spellEnd"/>
-            <w:r>
-              <w:rPr>
-                <w:rFonts w:ascii="Consolas" w:eastAsia="Times New Roman" w:hAnsi="Consolas" w:cs="Times New Roman"/>
-                <w:color w:val="000000"/>
-                <w:sz w:val="20"/>
-                <w:szCs w:val="20"/>
-                <w:lang w:val="en-US"/>
-              </w:rPr>
-              <w:t>()</w:t>
+              <w:t xml:space="preserve">    self.star.reset()</w:t>
             </w:r>
           </w:p>
         </w:tc>
@@ -3932,16 +3732,14 @@
           <w:color w:val="000000"/>
           <w:sz w:val="28"/>
           <w:szCs w:val="28"/>
-          <w:lang w:val="en-US"/>
-        </w:rPr>
-      </w:pPr>
-      <w:r>
-        <w:rPr>
-          <w:rFonts w:ascii="Times New Roman" w:eastAsia="Times New Roman" w:hAnsi="Times New Roman" w:cs="Times New Roman"/>
-          <w:color w:val="000000"/>
-          <w:sz w:val="28"/>
-          <w:szCs w:val="28"/>
-          <w:lang w:val="en-US"/>
+        </w:rPr>
+      </w:pPr>
+      <w:r>
+        <w:rPr>
+          <w:rFonts w:ascii="Times New Roman" w:eastAsia="Times New Roman" w:hAnsi="Times New Roman" w:cs="Times New Roman"/>
+          <w:color w:val="000000"/>
+          <w:sz w:val="28"/>
+          <w:szCs w:val="28"/>
         </w:rPr>
         <w:lastRenderedPageBreak/>
         <w:br/>
@@ -3984,7 +3782,6 @@
         <w:br/>
         <w:t xml:space="preserve">В процессе разработки были изучены основы работы с библиотекой </w:t>
       </w:r>
-      <w:proofErr w:type="spellStart"/>
       <w:r>
         <w:rPr>
           <w:rFonts w:ascii="Times New Roman" w:eastAsia="Times New Roman" w:hAnsi="Times New Roman" w:cs="Times New Roman"/>
@@ -3995,7 +3792,6 @@
         </w:rPr>
         <w:t>Pygame</w:t>
       </w:r>
-      <w:proofErr w:type="spellEnd"/>
       <w:r>
         <w:rPr>
           <w:rFonts w:ascii="Times New Roman" w:eastAsia="Times New Roman" w:hAnsi="Times New Roman" w:cs="Times New Roman"/>
@@ -4119,27 +3915,7 @@
           <w:szCs w:val="28"/>
         </w:rPr>
         <w:br/>
-        <w:t xml:space="preserve">Создан репозиторий на </w:t>
-      </w:r>
-      <w:proofErr w:type="spellStart"/>
-      <w:r>
-        <w:rPr>
-          <w:rFonts w:ascii="Times New Roman" w:eastAsia="Times New Roman" w:hAnsi="Times New Roman" w:cs="Times New Roman"/>
-          <w:color w:val="000000"/>
-          <w:sz w:val="28"/>
-          <w:szCs w:val="28"/>
-        </w:rPr>
-        <w:t>GitHub</w:t>
-      </w:r>
-      <w:proofErr w:type="spellEnd"/>
-      <w:r>
-        <w:rPr>
-          <w:rFonts w:ascii="Times New Roman" w:eastAsia="Times New Roman" w:hAnsi="Times New Roman" w:cs="Times New Roman"/>
-          <w:color w:val="000000"/>
-          <w:sz w:val="28"/>
-          <w:szCs w:val="28"/>
-        </w:rPr>
-        <w:t>. Освоены</w:t>
+        <w:t>Создан репозиторий на GitHub. Освоены</w:t>
       </w:r>
       <w:r>
         <w:rPr>
@@ -4196,27 +3972,7 @@
           <w:sz w:val="28"/>
           <w:szCs w:val="28"/>
         </w:rPr>
-        <w:t xml:space="preserve">Весь проект синхронизировался через </w:t>
-      </w:r>
-      <w:proofErr w:type="spellStart"/>
-      <w:r>
-        <w:rPr>
-          <w:rFonts w:ascii="Times New Roman" w:eastAsia="Times New Roman" w:hAnsi="Times New Roman" w:cs="Times New Roman"/>
-          <w:color w:val="000000"/>
-          <w:sz w:val="28"/>
-          <w:szCs w:val="28"/>
-        </w:rPr>
-        <w:t>GitHub</w:t>
-      </w:r>
-      <w:proofErr w:type="spellEnd"/>
-      <w:r>
-        <w:rPr>
-          <w:rFonts w:ascii="Times New Roman" w:eastAsia="Times New Roman" w:hAnsi="Times New Roman" w:cs="Times New Roman"/>
-          <w:color w:val="000000"/>
-          <w:sz w:val="28"/>
-          <w:szCs w:val="28"/>
-        </w:rPr>
-        <w:t xml:space="preserve"> Desktop.</w:t>
+        <w:t>Весь проект синхронизировался через GitHub Desktop.</w:t>
       </w:r>
       <w:r>
         <w:rPr>
@@ -4264,7 +4020,25 @@
           <w:szCs w:val="28"/>
         </w:rPr>
         <w:br/>
-        <w:t>1. Разработан полноценный статический сайт «ЭКОПУЛЬС» с современным интерфейсом и адаптивной структурой.</w:t>
+        <w:t>1. Разработан полноценный статический сайт «</w:t>
+      </w:r>
+      <w:r>
+        <w:rPr>
+          <w:rFonts w:ascii="Times New Roman" w:eastAsia="Times New Roman" w:hAnsi="Times New Roman" w:cs="Times New Roman"/>
+          <w:color w:val="000000"/>
+          <w:sz w:val="28"/>
+          <w:szCs w:val="28"/>
+        </w:rPr>
+        <w:t>Чат бот Салют</w:t>
+      </w:r>
+      <w:r>
+        <w:rPr>
+          <w:rFonts w:ascii="Times New Roman" w:eastAsia="Times New Roman" w:hAnsi="Times New Roman" w:cs="Times New Roman"/>
+          <w:color w:val="000000"/>
+          <w:sz w:val="28"/>
+          <w:szCs w:val="28"/>
+        </w:rPr>
+        <w:t>» с современным интерфейсом и адаптивной структурой.</w:t>
       </w:r>
       <w:r>
         <w:rPr>
@@ -4446,29 +4220,7 @@
                 <w:szCs w:val="20"/>
                 <w:lang w:val="en-US"/>
               </w:rPr>
-              <w:t>.</w:t>
-            </w:r>
-            <w:proofErr w:type="spellStart"/>
-            <w:r>
-              <w:rPr>
-                <w:rFonts w:ascii="Consolas" w:eastAsia="Times New Roman" w:hAnsi="Consolas" w:cs="Times New Roman"/>
-                <w:color w:val="000000"/>
-                <w:sz w:val="20"/>
-                <w:szCs w:val="20"/>
-                <w:lang w:val="en-US"/>
-              </w:rPr>
-              <w:t>btn</w:t>
-            </w:r>
-            <w:proofErr w:type="spellEnd"/>
-            <w:r>
-              <w:rPr>
-                <w:rFonts w:ascii="Consolas" w:eastAsia="Times New Roman" w:hAnsi="Consolas" w:cs="Times New Roman"/>
-                <w:color w:val="000000"/>
-                <w:sz w:val="20"/>
-                <w:szCs w:val="20"/>
-                <w:lang w:val="en-US"/>
-              </w:rPr>
-              <w:t xml:space="preserve"> {</w:t>
+              <w:t>.btn {</w:t>
             </w:r>
           </w:p>
           <w:p>
@@ -4712,7 +4464,6 @@
           <w:color w:val="000000"/>
           <w:sz w:val="28"/>
           <w:szCs w:val="28"/>
-          <w:lang w:val="en-US"/>
         </w:rPr>
       </w:pPr>
       <w:r>
@@ -4782,7 +4533,6 @@
         </w:rPr>
         <w:t xml:space="preserve"> с использованием библиотеки </w:t>
       </w:r>
-      <w:proofErr w:type="spellStart"/>
       <w:r>
         <w:rPr>
           <w:rFonts w:ascii="Times New Roman" w:eastAsia="Times New Roman" w:hAnsi="Times New Roman" w:cs="Times New Roman"/>
@@ -4793,7 +4543,6 @@
         </w:rPr>
         <w:t>Pygame</w:t>
       </w:r>
-      <w:proofErr w:type="spellEnd"/>
       <w:r>
         <w:rPr>
           <w:rFonts w:ascii="Times New Roman" w:eastAsia="Times New Roman" w:hAnsi="Times New Roman" w:cs="Times New Roman"/>
@@ -4875,29 +4624,7 @@
                 <w:szCs w:val="20"/>
                 <w:lang w:val="en-US"/>
               </w:rPr>
-              <w:t xml:space="preserve">    def __</w:t>
-            </w:r>
-            <w:proofErr w:type="spellStart"/>
-            <w:r>
-              <w:rPr>
-                <w:rFonts w:ascii="Consolas" w:eastAsia="Times New Roman" w:hAnsi="Consolas" w:cs="Times New Roman"/>
-                <w:color w:val="000000"/>
-                <w:sz w:val="20"/>
-                <w:szCs w:val="20"/>
-                <w:lang w:val="en-US"/>
-              </w:rPr>
-              <w:t>init</w:t>
-            </w:r>
-            <w:proofErr w:type="spellEnd"/>
-            <w:r>
-              <w:rPr>
-                <w:rFonts w:ascii="Consolas" w:eastAsia="Times New Roman" w:hAnsi="Consolas" w:cs="Times New Roman"/>
-                <w:color w:val="000000"/>
-                <w:sz w:val="20"/>
-                <w:szCs w:val="20"/>
-                <w:lang w:val="en-US"/>
-              </w:rPr>
-              <w:t>__(self):</w:t>
+              <w:t xml:space="preserve">    def __init__(self):</w:t>
             </w:r>
           </w:p>
           <w:p>
@@ -4933,29 +4660,7 @@
                 <w:szCs w:val="20"/>
                 <w:lang w:val="en-US"/>
               </w:rPr>
-              <w:t xml:space="preserve">        </w:t>
-            </w:r>
-            <w:proofErr w:type="spellStart"/>
-            <w:r>
-              <w:rPr>
-                <w:rFonts w:ascii="Consolas" w:eastAsia="Times New Roman" w:hAnsi="Consolas" w:cs="Times New Roman"/>
-                <w:color w:val="000000"/>
-                <w:sz w:val="20"/>
-                <w:szCs w:val="20"/>
-                <w:lang w:val="en-US"/>
-              </w:rPr>
-              <w:t>self.player</w:t>
-            </w:r>
-            <w:proofErr w:type="spellEnd"/>
-            <w:r>
-              <w:rPr>
-                <w:rFonts w:ascii="Consolas" w:eastAsia="Times New Roman" w:hAnsi="Consolas" w:cs="Times New Roman"/>
-                <w:color w:val="000000"/>
-                <w:sz w:val="20"/>
-                <w:szCs w:val="20"/>
-                <w:lang w:val="en-US"/>
-              </w:rPr>
-              <w:t xml:space="preserve"> = Player(</w:t>
+              <w:t xml:space="preserve">        self.player = Player(</w:t>
             </w:r>
           </w:p>
           <w:p>
@@ -5060,29 +4765,7 @@
                 <w:szCs w:val="20"/>
                 <w:lang w:val="en-US"/>
               </w:rPr>
-              <w:t xml:space="preserve">        </w:t>
-            </w:r>
-            <w:proofErr w:type="spellStart"/>
-            <w:r>
-              <w:rPr>
-                <w:rFonts w:ascii="Consolas" w:eastAsia="Times New Roman" w:hAnsi="Consolas" w:cs="Times New Roman"/>
-                <w:color w:val="000000"/>
-                <w:sz w:val="20"/>
-                <w:szCs w:val="20"/>
-                <w:lang w:val="en-US"/>
-              </w:rPr>
-              <w:t>self.star</w:t>
-            </w:r>
-            <w:proofErr w:type="spellEnd"/>
-            <w:r>
-              <w:rPr>
-                <w:rFonts w:ascii="Consolas" w:eastAsia="Times New Roman" w:hAnsi="Consolas" w:cs="Times New Roman"/>
-                <w:color w:val="000000"/>
-                <w:sz w:val="20"/>
-                <w:szCs w:val="20"/>
-                <w:lang w:val="en-US"/>
-              </w:rPr>
-              <w:t xml:space="preserve"> = Star()</w:t>
+              <w:t xml:space="preserve">        self.star = Star()</w:t>
             </w:r>
           </w:p>
           <w:p>
@@ -5118,29 +4801,7 @@
                 <w:szCs w:val="20"/>
                 <w:lang w:val="en-US"/>
               </w:rPr>
-              <w:t xml:space="preserve">        </w:t>
-            </w:r>
-            <w:proofErr w:type="spellStart"/>
-            <w:r>
-              <w:rPr>
-                <w:rFonts w:ascii="Consolas" w:eastAsia="Times New Roman" w:hAnsi="Consolas" w:cs="Times New Roman"/>
-                <w:color w:val="000000"/>
-                <w:sz w:val="20"/>
-                <w:szCs w:val="20"/>
-                <w:lang w:val="en-US"/>
-              </w:rPr>
-              <w:t>self.score</w:t>
-            </w:r>
-            <w:proofErr w:type="spellEnd"/>
-            <w:r>
-              <w:rPr>
-                <w:rFonts w:ascii="Consolas" w:eastAsia="Times New Roman" w:hAnsi="Consolas" w:cs="Times New Roman"/>
-                <w:color w:val="000000"/>
-                <w:sz w:val="20"/>
-                <w:szCs w:val="20"/>
-                <w:lang w:val="en-US"/>
-              </w:rPr>
-              <w:t xml:space="preserve"> = 0</w:t>
+              <w:t xml:space="preserve">        self.score = 0</w:t>
             </w:r>
           </w:p>
           <w:p>
@@ -5163,29 +4824,7 @@
                 <w:szCs w:val="20"/>
                 <w:lang w:val="en-US"/>
               </w:rPr>
-              <w:t xml:space="preserve">        </w:t>
-            </w:r>
-            <w:proofErr w:type="spellStart"/>
-            <w:r>
-              <w:rPr>
-                <w:rFonts w:ascii="Consolas" w:eastAsia="Times New Roman" w:hAnsi="Consolas" w:cs="Times New Roman"/>
-                <w:color w:val="000000"/>
-                <w:sz w:val="20"/>
-                <w:szCs w:val="20"/>
-                <w:lang w:val="en-US"/>
-              </w:rPr>
-              <w:t>self.game_over</w:t>
-            </w:r>
-            <w:proofErr w:type="spellEnd"/>
-            <w:r>
-              <w:rPr>
-                <w:rFonts w:ascii="Consolas" w:eastAsia="Times New Roman" w:hAnsi="Consolas" w:cs="Times New Roman"/>
-                <w:color w:val="000000"/>
-                <w:sz w:val="20"/>
-                <w:szCs w:val="20"/>
-                <w:lang w:val="en-US"/>
-              </w:rPr>
-              <w:t xml:space="preserve"> = False</w:t>
+              <w:t xml:space="preserve">        self.game_over = False</w:t>
             </w:r>
           </w:p>
         </w:tc>
@@ -5201,16 +4840,14 @@
           <w:color w:val="000000"/>
           <w:sz w:val="28"/>
           <w:szCs w:val="28"/>
-          <w:lang w:val="en-US"/>
-        </w:rPr>
-      </w:pPr>
-      <w:r>
-        <w:rPr>
-          <w:rFonts w:ascii="Times New Roman" w:eastAsia="Times New Roman" w:hAnsi="Times New Roman" w:cs="Times New Roman"/>
-          <w:color w:val="000000"/>
-          <w:sz w:val="28"/>
-          <w:szCs w:val="28"/>
-          <w:lang w:val="en-US"/>
+        </w:rPr>
+      </w:pPr>
+      <w:r>
+        <w:rPr>
+          <w:rFonts w:ascii="Times New Roman" w:eastAsia="Times New Roman" w:hAnsi="Times New Roman" w:cs="Times New Roman"/>
+          <w:color w:val="000000"/>
+          <w:sz w:val="28"/>
+          <w:szCs w:val="28"/>
         </w:rPr>
         <w:br/>
       </w:r>
@@ -5220,7 +4857,6 @@
           <w:color w:val="000000"/>
           <w:sz w:val="28"/>
           <w:szCs w:val="28"/>
-          <w:lang w:val="en-US"/>
         </w:rPr>
         <w:br/>
       </w:r>
@@ -5281,7 +4917,25 @@
           <w:szCs w:val="28"/>
         </w:rPr>
         <w:lastRenderedPageBreak/>
-        <w:t xml:space="preserve">В ходе проектной практики были успешно выполнены все поставленные задачи. Разработан статический сайт «ЭКОПУЛЬС», посвящённый экологической тематике и устойчивому развитию городской среды. Проект позволил закрепить знания по </w:t>
+        <w:t>В ходе проектной практики были успешно выполнены все поставленные задачи. Разработан статический сайт «</w:t>
+      </w:r>
+      <w:r>
+        <w:rPr>
+          <w:rFonts w:ascii="Times New Roman" w:eastAsia="Times New Roman" w:hAnsi="Times New Roman" w:cs="Times New Roman"/>
+          <w:color w:val="000000"/>
+          <w:sz w:val="28"/>
+          <w:szCs w:val="28"/>
+        </w:rPr>
+        <w:t>Чат бот Салют</w:t>
+      </w:r>
+      <w:r>
+        <w:rPr>
+          <w:rFonts w:ascii="Times New Roman" w:eastAsia="Times New Roman" w:hAnsi="Times New Roman" w:cs="Times New Roman"/>
+          <w:color w:val="000000"/>
+          <w:sz w:val="28"/>
+          <w:szCs w:val="28"/>
+        </w:rPr>
+        <w:t xml:space="preserve">», посвящённый экологической тематике и устойчивому развитию городской среды. Проект позволил закрепить знания по </w:t>
       </w:r>
       <w:r>
         <w:rPr>
@@ -5397,7 +5051,6 @@
         </w:rPr>
         <w:t xml:space="preserve"> и работы с библиотекой </w:t>
       </w:r>
-      <w:proofErr w:type="spellStart"/>
       <w:r>
         <w:rPr>
           <w:rFonts w:ascii="Times New Roman" w:eastAsia="Times New Roman" w:hAnsi="Times New Roman" w:cs="Times New Roman"/>
@@ -5408,7 +5061,6 @@
         </w:rPr>
         <w:t>Pygame</w:t>
       </w:r>
-      <w:proofErr w:type="spellEnd"/>
       <w:r>
         <w:rPr>
           <w:rFonts w:ascii="Times New Roman" w:eastAsia="Times New Roman" w:hAnsi="Times New Roman" w:cs="Times New Roman"/>
@@ -5706,7 +5358,6 @@
         <w:br/>
         <w:t xml:space="preserve">4. Документация библиотеки </w:t>
       </w:r>
-      <w:proofErr w:type="spellStart"/>
       <w:r>
         <w:rPr>
           <w:rFonts w:ascii="Times New Roman" w:eastAsia="Times New Roman" w:hAnsi="Times New Roman" w:cs="Times New Roman"/>
@@ -5717,7 +5368,6 @@
         </w:rPr>
         <w:t>Pygame</w:t>
       </w:r>
-      <w:proofErr w:type="spellEnd"/>
       <w:r>
         <w:rPr>
           <w:rFonts w:ascii="Times New Roman" w:eastAsia="Times New Roman" w:hAnsi="Times New Roman" w:cs="Times New Roman"/>
@@ -5727,7 +5377,6 @@
         </w:rPr>
         <w:t xml:space="preserve"> — </w:t>
       </w:r>
-      <w:proofErr w:type="spellStart"/>
       <w:r>
         <w:rPr>
           <w:rFonts w:ascii="Times New Roman" w:eastAsia="Times New Roman" w:hAnsi="Times New Roman" w:cs="Times New Roman"/>
@@ -5738,7 +5387,6 @@
         </w:rPr>
         <w:t>pygame</w:t>
       </w:r>
-      <w:proofErr w:type="spellEnd"/>
       <w:r>
         <w:rPr>
           <w:rFonts w:ascii="Times New Roman" w:eastAsia="Times New Roman" w:hAnsi="Times New Roman" w:cs="Times New Roman"/>
@@ -5824,7 +5472,6 @@
           <w:sz w:val="28"/>
           <w:szCs w:val="28"/>
         </w:rPr>
-        <w:lastRenderedPageBreak/>
         <w:t>Приложение А —</w:t>
       </w:r>
       <w:r>
@@ -5843,7 +5490,25 @@
           <w:sz w:val="28"/>
           <w:szCs w:val="28"/>
         </w:rPr>
-        <w:t>сайта «ЭКОПУЛЬС».</w:t>
+        <w:t>сайта «</w:t>
+      </w:r>
+      <w:r>
+        <w:rPr>
+          <w:rFonts w:ascii="Times New Roman" w:eastAsia="Times New Roman" w:hAnsi="Times New Roman" w:cs="Times New Roman"/>
+          <w:color w:val="000000"/>
+          <w:sz w:val="28"/>
+          <w:szCs w:val="28"/>
+        </w:rPr>
+        <w:t>Чат бот Салют</w:t>
+      </w:r>
+      <w:r>
+        <w:rPr>
+          <w:rFonts w:ascii="Times New Roman" w:eastAsia="Times New Roman" w:hAnsi="Times New Roman" w:cs="Times New Roman"/>
+          <w:color w:val="000000"/>
+          <w:sz w:val="28"/>
+          <w:szCs w:val="28"/>
+        </w:rPr>
+        <w:t>».</w:t>
       </w:r>
       <w:r>
         <w:rPr>
@@ -5862,10 +5527,10 @@
           <w:szCs w:val="28"/>
         </w:rPr>
         <w:drawing>
-          <wp:inline distT="0" distB="0" distL="0" distR="0" wp14:anchorId="5856B9BC" wp14:editId="14C6E5F9">
-            <wp:extent cx="6300470" cy="5683250"/>
+          <wp:inline distT="0" distB="0" distL="0" distR="0" wp14:anchorId="4D087A17" wp14:editId="3951731D">
+            <wp:extent cx="6300470" cy="2820035"/>
             <wp:effectExtent l="0" t="0" r="5080" b="0"/>
-            <wp:docPr id="1070482205" name="Рисунок 1"/>
+            <wp:docPr id="516676316" name="Рисунок 1"/>
             <wp:cNvGraphicFramePr>
               <a:graphicFrameLocks xmlns:a="http://schemas.openxmlformats.org/drawingml/2006/main" noChangeAspect="1"/>
             </wp:cNvGraphicFramePr>
@@ -5873,64 +5538,11 @@
               <a:graphicData uri="http://schemas.openxmlformats.org/drawingml/2006/picture">
                 <pic:pic xmlns:pic="http://schemas.openxmlformats.org/drawingml/2006/picture">
                   <pic:nvPicPr>
-                    <pic:cNvPr id="1070482205" name=""/>
+                    <pic:cNvPr id="516676316" name=""/>
                     <pic:cNvPicPr/>
                   </pic:nvPicPr>
                   <pic:blipFill>
                     <a:blip r:embed="rId8"/>
-                    <a:stretch>
-                      <a:fillRect/>
-                    </a:stretch>
-                  </pic:blipFill>
-                  <pic:spPr>
-                    <a:xfrm>
-                      <a:off x="0" y="0"/>
-                      <a:ext cx="6300470" cy="5683250"/>
-                    </a:xfrm>
-                    <a:prstGeom prst="rect">
-                      <a:avLst/>
-                    </a:prstGeom>
-                  </pic:spPr>
-                </pic:pic>
-              </a:graphicData>
-            </a:graphic>
-          </wp:inline>
-        </w:drawing>
-      </w:r>
-      <w:r>
-        <w:rPr>
-          <w:rFonts w:ascii="Times New Roman" w:eastAsia="Times New Roman" w:hAnsi="Times New Roman" w:cs="Times New Roman"/>
-          <w:color w:val="000000"/>
-          <w:sz w:val="28"/>
-          <w:szCs w:val="28"/>
-        </w:rPr>
-        <w:br/>
-      </w:r>
-      <w:r>
-        <w:rPr>
-          <w:rFonts w:ascii="Times New Roman" w:eastAsia="Times New Roman" w:hAnsi="Times New Roman" w:cs="Times New Roman"/>
-          <w:color w:val="000000"/>
-          <w:sz w:val="28"/>
-          <w:szCs w:val="28"/>
-        </w:rPr>
-        <w:lastRenderedPageBreak/>
-        <w:drawing>
-          <wp:inline distT="0" distB="0" distL="0" distR="0" wp14:anchorId="2C93EC33" wp14:editId="533F9656">
-            <wp:extent cx="6300470" cy="2820035"/>
-            <wp:effectExtent l="0" t="0" r="5080" b="0"/>
-            <wp:docPr id="1651987160" name="Рисунок 1"/>
-            <wp:cNvGraphicFramePr>
-              <a:graphicFrameLocks xmlns:a="http://schemas.openxmlformats.org/drawingml/2006/main" noChangeAspect="1"/>
-            </wp:cNvGraphicFramePr>
-            <a:graphic xmlns:a="http://schemas.openxmlformats.org/drawingml/2006/main">
-              <a:graphicData uri="http://schemas.openxmlformats.org/drawingml/2006/picture">
-                <pic:pic xmlns:pic="http://schemas.openxmlformats.org/drawingml/2006/picture">
-                  <pic:nvPicPr>
-                    <pic:cNvPr id="1651987160" name=""/>
-                    <pic:cNvPicPr/>
-                  </pic:nvPicPr>
-                  <pic:blipFill>
-                    <a:blip r:embed="rId9"/>
                     <a:stretch>
                       <a:fillRect/>
                     </a:stretch>
@@ -5950,27 +5562,32 @@
           </wp:inline>
         </w:drawing>
       </w:r>
-      <w:r>
-        <w:rPr>
-          <w:rFonts w:ascii="Times New Roman" w:eastAsia="Times New Roman" w:hAnsi="Times New Roman" w:cs="Times New Roman"/>
-          <w:color w:val="000000"/>
-          <w:sz w:val="28"/>
-          <w:szCs w:val="28"/>
-        </w:rPr>
-        <w:br/>
-      </w:r>
-      <w:r>
-        <w:rPr>
-          <w:rFonts w:ascii="Times New Roman" w:eastAsia="Times New Roman" w:hAnsi="Times New Roman" w:cs="Times New Roman"/>
-          <w:color w:val="000000"/>
-          <w:sz w:val="28"/>
-          <w:szCs w:val="28"/>
-        </w:rPr>
+    </w:p>
+    <w:p>
+      <w:pPr>
+        <w:keepNext/>
+        <w:keepLines/>
+        <w:spacing w:after="0" w:line="360" w:lineRule="auto"/>
+        <w:rPr>
+          <w:rFonts w:ascii="Times New Roman" w:eastAsia="Times New Roman" w:hAnsi="Times New Roman" w:cs="Times New Roman"/>
+          <w:color w:val="000000"/>
+          <w:sz w:val="28"/>
+          <w:szCs w:val="28"/>
+        </w:rPr>
+      </w:pPr>
+      <w:r>
+        <w:rPr>
+          <w:rFonts w:ascii="Times New Roman" w:eastAsia="Times New Roman" w:hAnsi="Times New Roman" w:cs="Times New Roman"/>
+          <w:color w:val="000000"/>
+          <w:sz w:val="28"/>
+          <w:szCs w:val="28"/>
+        </w:rPr>
+        <w:lastRenderedPageBreak/>
         <w:drawing>
-          <wp:inline distT="0" distB="0" distL="0" distR="0" wp14:anchorId="63FD40ED" wp14:editId="7B724686">
-            <wp:extent cx="6300470" cy="4015105"/>
-            <wp:effectExtent l="0" t="0" r="5080" b="4445"/>
-            <wp:docPr id="1104554810" name="Рисунок 1"/>
+          <wp:inline distT="0" distB="0" distL="0" distR="0" wp14:anchorId="1D37FDD7" wp14:editId="1498F4BA">
+            <wp:extent cx="6300470" cy="4337050"/>
+            <wp:effectExtent l="0" t="0" r="5080" b="6350"/>
+            <wp:docPr id="200303296" name="Рисунок 1"/>
             <wp:cNvGraphicFramePr>
               <a:graphicFrameLocks xmlns:a="http://schemas.openxmlformats.org/drawingml/2006/main" noChangeAspect="1"/>
             </wp:cNvGraphicFramePr>
@@ -5978,7 +5595,63 @@
               <a:graphicData uri="http://schemas.openxmlformats.org/drawingml/2006/picture">
                 <pic:pic xmlns:pic="http://schemas.openxmlformats.org/drawingml/2006/picture">
                   <pic:nvPicPr>
-                    <pic:cNvPr id="1104554810" name=""/>
+                    <pic:cNvPr id="200303296" name=""/>
+                    <pic:cNvPicPr/>
+                  </pic:nvPicPr>
+                  <pic:blipFill>
+                    <a:blip r:embed="rId9"/>
+                    <a:stretch>
+                      <a:fillRect/>
+                    </a:stretch>
+                  </pic:blipFill>
+                  <pic:spPr>
+                    <a:xfrm>
+                      <a:off x="0" y="0"/>
+                      <a:ext cx="6300470" cy="4337050"/>
+                    </a:xfrm>
+                    <a:prstGeom prst="rect">
+                      <a:avLst/>
+                    </a:prstGeom>
+                  </pic:spPr>
+                </pic:pic>
+              </a:graphicData>
+            </a:graphic>
+          </wp:inline>
+        </w:drawing>
+      </w:r>
+    </w:p>
+    <w:p>
+      <w:pPr>
+        <w:keepNext/>
+        <w:keepLines/>
+        <w:spacing w:after="0" w:line="360" w:lineRule="auto"/>
+        <w:rPr>
+          <w:rFonts w:ascii="Times New Roman" w:eastAsia="Times New Roman" w:hAnsi="Times New Roman" w:cs="Times New Roman"/>
+          <w:color w:val="000000"/>
+          <w:sz w:val="28"/>
+          <w:szCs w:val="28"/>
+        </w:rPr>
+      </w:pPr>
+      <w:r>
+        <w:rPr>
+          <w:rFonts w:ascii="Times New Roman" w:eastAsia="Times New Roman" w:hAnsi="Times New Roman" w:cs="Times New Roman"/>
+          <w:color w:val="000000"/>
+          <w:sz w:val="28"/>
+          <w:szCs w:val="28"/>
+        </w:rPr>
+        <w:drawing>
+          <wp:inline distT="0" distB="0" distL="0" distR="0" wp14:anchorId="07250A17" wp14:editId="30881F1C">
+            <wp:extent cx="6300470" cy="3587750"/>
+            <wp:effectExtent l="0" t="0" r="5080" b="0"/>
+            <wp:docPr id="1916881459" name="Рисунок 1"/>
+            <wp:cNvGraphicFramePr>
+              <a:graphicFrameLocks xmlns:a="http://schemas.openxmlformats.org/drawingml/2006/main" noChangeAspect="1"/>
+            </wp:cNvGraphicFramePr>
+            <a:graphic xmlns:a="http://schemas.openxmlformats.org/drawingml/2006/main">
+              <a:graphicData uri="http://schemas.openxmlformats.org/drawingml/2006/picture">
+                <pic:pic xmlns:pic="http://schemas.openxmlformats.org/drawingml/2006/picture">
+                  <pic:nvPicPr>
+                    <pic:cNvPr id="1916881459" name=""/>
                     <pic:cNvPicPr/>
                   </pic:nvPicPr>
                   <pic:blipFill>
@@ -5990,7 +5663,7 @@
                   <pic:spPr>
                     <a:xfrm>
                       <a:off x="0" y="0"/>
-                      <a:ext cx="6300470" cy="4015105"/>
+                      <a:ext cx="6300470" cy="3587750"/>
                     </a:xfrm>
                     <a:prstGeom prst="rect">
                       <a:avLst/>
@@ -6024,10 +5697,10 @@
         </w:rPr>
         <w:lastRenderedPageBreak/>
         <w:drawing>
-          <wp:inline distT="0" distB="0" distL="0" distR="0" wp14:anchorId="061069C7" wp14:editId="39E0FA78">
-            <wp:extent cx="6300470" cy="2854960"/>
-            <wp:effectExtent l="0" t="0" r="5080" b="2540"/>
-            <wp:docPr id="357638691" name="Рисунок 1"/>
+          <wp:inline distT="0" distB="0" distL="0" distR="0" wp14:anchorId="1930F3B0" wp14:editId="40A88E60">
+            <wp:extent cx="6300470" cy="4648200"/>
+            <wp:effectExtent l="0" t="0" r="5080" b="0"/>
+            <wp:docPr id="201290912" name="Рисунок 1"/>
             <wp:cNvGraphicFramePr>
               <a:graphicFrameLocks xmlns:a="http://schemas.openxmlformats.org/drawingml/2006/main" noChangeAspect="1"/>
             </wp:cNvGraphicFramePr>
@@ -6035,7 +5708,7 @@
               <a:graphicData uri="http://schemas.openxmlformats.org/drawingml/2006/picture">
                 <pic:pic xmlns:pic="http://schemas.openxmlformats.org/drawingml/2006/picture">
                   <pic:nvPicPr>
-                    <pic:cNvPr id="357638691" name=""/>
+                    <pic:cNvPr id="201290912" name=""/>
                     <pic:cNvPicPr/>
                   </pic:nvPicPr>
                   <pic:blipFill>
@@ -6047,7 +5720,7 @@
                   <pic:spPr>
                     <a:xfrm>
                       <a:off x="0" y="0"/>
-                      <a:ext cx="6300470" cy="2854960"/>
+                      <a:ext cx="6300470" cy="4648200"/>
                     </a:xfrm>
                     <a:prstGeom prst="rect">
                       <a:avLst/>
@@ -6079,11 +5752,12 @@
           <w:sz w:val="28"/>
           <w:szCs w:val="28"/>
         </w:rPr>
+        <w:lastRenderedPageBreak/>
         <w:drawing>
-          <wp:inline distT="0" distB="0" distL="0" distR="0" wp14:anchorId="5B94D9C9" wp14:editId="5E1618E4">
-            <wp:extent cx="6300470" cy="3428365"/>
-            <wp:effectExtent l="0" t="0" r="5080" b="635"/>
-            <wp:docPr id="240944018" name="Рисунок 1"/>
+          <wp:inline distT="0" distB="0" distL="0" distR="0" wp14:anchorId="678816AE" wp14:editId="145D0A96">
+            <wp:extent cx="6300470" cy="5093970"/>
+            <wp:effectExtent l="0" t="0" r="5080" b="0"/>
+            <wp:docPr id="408846217" name="Рисунок 1"/>
             <wp:cNvGraphicFramePr>
               <a:graphicFrameLocks xmlns:a="http://schemas.openxmlformats.org/drawingml/2006/main" noChangeAspect="1"/>
             </wp:cNvGraphicFramePr>
@@ -6091,7 +5765,7 @@
               <a:graphicData uri="http://schemas.openxmlformats.org/drawingml/2006/picture">
                 <pic:pic xmlns:pic="http://schemas.openxmlformats.org/drawingml/2006/picture">
                   <pic:nvPicPr>
-                    <pic:cNvPr id="240944018" name=""/>
+                    <pic:cNvPr id="408846217" name=""/>
                     <pic:cNvPicPr/>
                   </pic:nvPicPr>
                   <pic:blipFill>
@@ -6103,7 +5777,7 @@
                   <pic:spPr>
                     <a:xfrm>
                       <a:off x="0" y="0"/>
-                      <a:ext cx="6300470" cy="3428365"/>
+                      <a:ext cx="6300470" cy="5093970"/>
                     </a:xfrm>
                     <a:prstGeom prst="rect">
                       <a:avLst/>
@@ -6123,63 +5797,15 @@
           <w:szCs w:val="28"/>
         </w:rPr>
         <w:br/>
-        <w:t>Приложение Б —</w:t>
-      </w:r>
-      <w:r>
-        <w:rPr>
-          <w:rFonts w:ascii="Times New Roman" w:eastAsia="Times New Roman" w:hAnsi="Times New Roman" w:cs="Times New Roman"/>
-          <w:color w:val="000000"/>
-          <w:sz w:val="28"/>
-          <w:szCs w:val="28"/>
-        </w:rPr>
-        <w:t xml:space="preserve">Скриншоты </w:t>
-      </w:r>
-      <w:r>
-        <w:rPr>
-          <w:rFonts w:ascii="Times New Roman" w:eastAsia="Times New Roman" w:hAnsi="Times New Roman" w:cs="Times New Roman"/>
-          <w:color w:val="000000"/>
-          <w:sz w:val="28"/>
-          <w:szCs w:val="28"/>
-        </w:rPr>
-        <w:t>игры «</w:t>
-      </w:r>
-      <w:r>
-        <w:rPr>
-          <w:rFonts w:ascii="Times New Roman" w:eastAsia="Times New Roman" w:hAnsi="Times New Roman" w:cs="Times New Roman"/>
-          <w:color w:val="000000"/>
-          <w:sz w:val="28"/>
-          <w:szCs w:val="28"/>
-          <w:lang w:val="en-US"/>
-        </w:rPr>
-        <w:t>Star</w:t>
-      </w:r>
-      <w:r>
-        <w:rPr>
-          <w:rFonts w:ascii="Times New Roman" w:eastAsia="Times New Roman" w:hAnsi="Times New Roman" w:cs="Times New Roman"/>
-          <w:color w:val="000000"/>
-          <w:sz w:val="28"/>
-          <w:szCs w:val="28"/>
-        </w:rPr>
-        <w:t xml:space="preserve"> </w:t>
-      </w:r>
-      <w:r>
-        <w:rPr>
-          <w:rFonts w:ascii="Times New Roman" w:eastAsia="Times New Roman" w:hAnsi="Times New Roman" w:cs="Times New Roman"/>
-          <w:color w:val="000000"/>
-          <w:sz w:val="28"/>
-          <w:szCs w:val="28"/>
-          <w:lang w:val="en-US"/>
-        </w:rPr>
-        <w:t>Catcher</w:t>
-      </w:r>
-      <w:r>
-        <w:rPr>
-          <w:rFonts w:ascii="Times New Roman" w:eastAsia="Times New Roman" w:hAnsi="Times New Roman" w:cs="Times New Roman"/>
-          <w:color w:val="000000"/>
-          <w:sz w:val="28"/>
-          <w:szCs w:val="28"/>
-        </w:rPr>
-        <w:t>».</w:t>
+      </w:r>
+      <w:r>
+        <w:rPr>
+          <w:rFonts w:ascii="Times New Roman" w:eastAsia="Times New Roman" w:hAnsi="Times New Roman" w:cs="Times New Roman"/>
+          <w:color w:val="000000"/>
+          <w:sz w:val="28"/>
+          <w:szCs w:val="28"/>
+        </w:rPr>
+        <w:br/>
       </w:r>
     </w:p>
     <w:p>
@@ -6194,9 +5820,102 @@
           <w:szCs w:val="28"/>
         </w:rPr>
       </w:pPr>
-      <w:r>
-        <w:rPr>
-          <w:rFonts w:ascii="Times New Roman" w:eastAsia="Times New Roman" w:hAnsi="Times New Roman" w:cs="Times New Roman"/>
+    </w:p>
+    <w:p>
+      <w:pPr>
+        <w:keepNext/>
+        <w:keepLines/>
+        <w:spacing w:after="0" w:line="360" w:lineRule="auto"/>
+        <w:rPr>
+          <w:rFonts w:ascii="Times New Roman" w:eastAsia="Times New Roman" w:hAnsi="Times New Roman" w:cs="Times New Roman"/>
+          <w:color w:val="000000"/>
+          <w:sz w:val="28"/>
+          <w:szCs w:val="28"/>
+        </w:rPr>
+      </w:pPr>
+      <w:r>
+        <w:rPr>
+          <w:rFonts w:ascii="Times New Roman" w:eastAsia="Times New Roman" w:hAnsi="Times New Roman" w:cs="Times New Roman"/>
+          <w:color w:val="000000"/>
+          <w:sz w:val="28"/>
+          <w:szCs w:val="28"/>
+        </w:rPr>
+        <w:br/>
+        <w:t>Приложение Б —</w:t>
+      </w:r>
+      <w:r>
+        <w:rPr>
+          <w:rFonts w:ascii="Times New Roman" w:eastAsia="Times New Roman" w:hAnsi="Times New Roman" w:cs="Times New Roman"/>
+          <w:color w:val="000000"/>
+          <w:sz w:val="28"/>
+          <w:szCs w:val="28"/>
+        </w:rPr>
+        <w:t xml:space="preserve">Скриншоты </w:t>
+      </w:r>
+      <w:r>
+        <w:rPr>
+          <w:rFonts w:ascii="Times New Roman" w:eastAsia="Times New Roman" w:hAnsi="Times New Roman" w:cs="Times New Roman"/>
+          <w:color w:val="000000"/>
+          <w:sz w:val="28"/>
+          <w:szCs w:val="28"/>
+        </w:rPr>
+        <w:t>игры «</w:t>
+      </w:r>
+      <w:r>
+        <w:rPr>
+          <w:rFonts w:ascii="Times New Roman" w:eastAsia="Times New Roman" w:hAnsi="Times New Roman" w:cs="Times New Roman"/>
+          <w:color w:val="000000"/>
+          <w:sz w:val="28"/>
+          <w:szCs w:val="28"/>
+          <w:lang w:val="en-US"/>
+        </w:rPr>
+        <w:t>Star</w:t>
+      </w:r>
+      <w:r>
+        <w:rPr>
+          <w:rFonts w:ascii="Times New Roman" w:eastAsia="Times New Roman" w:hAnsi="Times New Roman" w:cs="Times New Roman"/>
+          <w:color w:val="000000"/>
+          <w:sz w:val="28"/>
+          <w:szCs w:val="28"/>
+        </w:rPr>
+        <w:t xml:space="preserve"> </w:t>
+      </w:r>
+      <w:r>
+        <w:rPr>
+          <w:rFonts w:ascii="Times New Roman" w:eastAsia="Times New Roman" w:hAnsi="Times New Roman" w:cs="Times New Roman"/>
+          <w:color w:val="000000"/>
+          <w:sz w:val="28"/>
+          <w:szCs w:val="28"/>
+          <w:lang w:val="en-US"/>
+        </w:rPr>
+        <w:t>Catcher</w:t>
+      </w:r>
+      <w:r>
+        <w:rPr>
+          <w:rFonts w:ascii="Times New Roman" w:eastAsia="Times New Roman" w:hAnsi="Times New Roman" w:cs="Times New Roman"/>
+          <w:color w:val="000000"/>
+          <w:sz w:val="28"/>
+          <w:szCs w:val="28"/>
+        </w:rPr>
+        <w:t>».</w:t>
+      </w:r>
+    </w:p>
+    <w:p>
+      <w:pPr>
+        <w:keepNext/>
+        <w:keepLines/>
+        <w:spacing w:after="0" w:line="360" w:lineRule="auto"/>
+        <w:rPr>
+          <w:rFonts w:ascii="Times New Roman" w:eastAsia="Times New Roman" w:hAnsi="Times New Roman" w:cs="Times New Roman"/>
+          <w:color w:val="000000"/>
+          <w:sz w:val="28"/>
+          <w:szCs w:val="28"/>
+        </w:rPr>
+      </w:pPr>
+      <w:r>
+        <w:rPr>
+          <w:rFonts w:ascii="Times New Roman" w:eastAsia="Times New Roman" w:hAnsi="Times New Roman" w:cs="Times New Roman"/>
+          <w:noProof/>
           <w:color w:val="000000"/>
           <w:sz w:val="28"/>
           <w:szCs w:val="28"/>
@@ -6254,6 +5973,7 @@
       <w:r>
         <w:rPr>
           <w:rFonts w:ascii="Times New Roman" w:eastAsia="Times New Roman" w:hAnsi="Times New Roman" w:cs="Times New Roman"/>
+          <w:noProof/>
           <w:color w:val="000000"/>
           <w:sz w:val="28"/>
           <w:szCs w:val="28"/>

</xml_diff>